<commit_message>
Clarify UNPHU digital coordination role
</commit_message>
<xml_diff>
--- a/resume/Cindy-Guzman-ATS-Resume.docx
+++ b/resume/Cindy-Guzman-ATS-Resume.docx
@@ -50,7 +50,7 @@
     </w:p>
     <w:p>
       <w:r>
-        <w:t>Web Developer and UX/UI Designer with experience designing, building and maintaining responsive websites, digital platforms and product interfaces. Strong background in WordPress and CMS-based development, supported by UX research, information architecture, prototyping and front-end fundamentals. Uses AI-assisted development workflows to move product requirements and interface designs toward tested, functional releases.</w:t>
+        <w:t>Web Developer and UX/UI Designer with 8+ years of experience designing, building and maintaining responsive websites, digital platforms and product interfaces. Strong background in WordPress and CMS-based development, supported by UX research, information architecture, prototyping and front-end fundamentals. Uses AI-assisted development workflows to move product requirements and interface designs toward tested, functional releases.</w:t>
       </w:r>
     </w:p>
     <w:p>
@@ -143,10 +143,10 @@
         <w:rPr>
           <w:b/>
         </w:rPr>
-        <w:t>Content &amp; Publications | UNPHU</w:t>
+        <w:t>Digital Content &amp; Publications Coordinator | UNPHU</w:t>
       </w:r>
       <w:r>
-        <w:t xml:space="preserve"> | Current</w:t>
+        <w:t xml:space="preserve"> | Aug 2025 – Present</w:t>
       </w:r>
     </w:p>
     <w:p>
@@ -154,7 +154,51 @@
         <w:ind w:left="173"/>
       </w:pPr>
       <w:r>
-        <w:t>Support content, publications and digital work across institutional platforms in a university environment.</w:t>
+        <w:t>Coordinate websites, applications, digital content and publications for the Vice-Rectorate of Research, Extension and Internationalization Projects across institutional platforms.</w:t>
+      </w:r>
+    </w:p>
+    <w:p>
+      <w:pPr>
+        <w:spacing w:before="60"/>
+      </w:pPr>
+      <w:r>
+        <w:rPr>
+          <w:b/>
+        </w:rPr>
+        <w:t>UX &amp; Editorial Designer, Academic Journal | UNPHU</w:t>
+      </w:r>
+      <w:r>
+        <w:t xml:space="preserve"> | Oct 2023 – Present</w:t>
+      </w:r>
+    </w:p>
+    <w:p>
+      <w:pPr>
+        <w:ind w:left="173"/>
+      </w:pPr>
+      <w:r>
+        <w:t>Lead UX and editorial design for the Journal of Sciences and Humanities, shaping web presentation and reader experience for peer-reviewed content.</w:t>
+      </w:r>
+    </w:p>
+    <w:p>
+      <w:pPr>
+        <w:spacing w:before="60"/>
+      </w:pPr>
+      <w:r>
+        <w:rPr>
+          <w:b/>
+        </w:rPr>
+        <w:t>UX/UI Designer (Contract) | ICQ24 Inc.</w:t>
+      </w:r>
+      <w:r>
+        <w:t xml:space="preserve"> | Apr 2023 – May 2024</w:t>
+      </w:r>
+    </w:p>
+    <w:p>
+      <w:pPr>
+        <w:ind w:left="173"/>
+      </w:pPr>
+      <w:r>
+        <w:t>Delivered UX/UI design for the Cervecería Nacional Dominicana account, translating business and user needs into clear, usable interfaces with a multidisciplinary, multinational team.</w:t>
       </w:r>
     </w:p>
     <w:p>
@@ -168,7 +212,7 @@
         <w:t>Web Developer | Behealth PR</w:t>
       </w:r>
       <w:r>
-        <w:t xml:space="preserve"> | Jun 2022 – Present</w:t>
+        <w:t xml:space="preserve"> | Jun 2022 – Aug 2024</w:t>
       </w:r>
     </w:p>
     <w:p>
@@ -176,7 +220,7 @@
         <w:ind w:left="173"/>
       </w:pPr>
       <w:r>
-        <w:t>Build, update and maintain production websites for a Puerto Rico-based healthcare client, improving content delivery, usability and day-to-day reliability.</w:t>
+        <w:t>Built, updated and maintained production websites for a Puerto Rico-based healthcare client, improving content delivery, usability and day-to-day reliability.</w:t>
       </w:r>
     </w:p>
     <w:p>
@@ -209,7 +253,7 @@
         <w:rPr>
           <w:b/>
         </w:rPr>
-        <w:t>Web Developer &amp; Web Department Coordinator | Gmedia Dominicana</w:t>
+        <w:t>Web Department Coordinator | Gmedia Dominicana</w:t>
       </w:r>
       <w:r>
         <w:t xml:space="preserve"> | Aug 2019 – Nov 2021</w:t>
@@ -220,7 +264,29 @@
         <w:ind w:left="173"/>
       </w:pPr>
       <w:r>
-        <w:t>Coordinated web production and built and maintained WordPress, Joomla and Shopify websites for multiple clients.</w:t>
+        <w:t>Coordinated web production, client relationships and a small team; built and maintained WordPress, Joomla and Shopify websites for multiple clients.</w:t>
+      </w:r>
+    </w:p>
+    <w:p>
+      <w:pPr>
+        <w:spacing w:before="60"/>
+      </w:pPr>
+      <w:r>
+        <w:rPr>
+          <w:b/>
+        </w:rPr>
+        <w:t>Web Page &amp; Graphic Designer | Zagirova Design</w:t>
+      </w:r>
+      <w:r>
+        <w:t xml:space="preserve"> | Apr 2017 – Jul 2019</w:t>
+      </w:r>
+    </w:p>
+    <w:p>
+      <w:pPr>
+        <w:ind w:left="173"/>
+      </w:pPr>
+      <w:r>
+        <w:t>Designed and built WordPress and Joomla websites with WooCommerce, SEO and Elementor, alongside graphic design and social media assets.</w:t>
       </w:r>
     </w:p>
     <w:p>

</xml_diff>